<commit_message>
Update install doc: JasonKrogulski paths -> current maintainer, fix filename
QP_WatcherInstall.docx still referenced the original handoff sender's
Windows username in example paths, and named requirements.txt instead of
the actual committed requirements-watcher.txt.
</commit_message>
<xml_diff>
--- a/QP_WatcherInstall.docx
+++ b/QP_WatcherInstall.docx
@@ -100,7 +100,7 @@
           </w:tcPr>
           <w:p>
             <w:r>
-              <w:t>C:\Users\JasonKrogulski\Documents\</w:t>
+              <w:t>C:\Users\RileySasiain\Documents\</w:t>
             </w:r>
           </w:p>
         </w:tc>
@@ -122,7 +122,7 @@
           </w:tcPr>
           <w:p>
             <w:r>
-              <w:t>requirements.txt</w:t>
+              <w:t>requirements-watcher.txt</w:t>
             </w:r>
           </w:p>
         </w:tc>
@@ -139,7 +139,7 @@
           </w:tcPr>
           <w:p>
             <w:r>
-              <w:t>C:\Users\JasonKrogulski\Documents\ (just created)</w:t>
+              <w:t>C:\Users\RileySasiain\Documents\ (just created)</w:t>
             </w:r>
           </w:p>
         </w:tc>
@@ -178,7 +178,7 @@
           </w:tcPr>
           <w:p>
             <w:r>
-              <w:t>C:\Users\JasonKrogulski\Desktop\RawFiles\</w:t>
+              <w:t>C:\Users\RileySasiain\Desktop\RawFiles\</w:t>
             </w:r>
           </w:p>
         </w:tc>
@@ -319,12 +319,12 @@
     </w:p>
     <w:p>
       <w:r>
-        <w:t>INCOMING_DIR = Path(r"C:\Users\JasonKrogulski\Desktop\RawFiles")</w:t>
-      </w:r>
-    </w:p>
-    <w:p>
-      <w:r>
-        <w:t>Change JasonKrogulski to your own Windows username. Save the file.</w:t>
+        <w:t>INCOMING_DIR = Path(r"C:\Users\RileySasiain\Desktop\RawFiles")</w:t>
+      </w:r>
+    </w:p>
+    <w:p>
+      <w:r>
+        <w:t>Change RileySasiain to your own Windows username. Save the file.</w:t>
       </w:r>
     </w:p>
     <w:p>
@@ -356,7 +356,7 @@
     </w:p>
     <w:p>
       <w:r>
-        <w:t>pip install -r "C:\Users\YOUR_USERNAME\Documents\requirements.txt"</w:t>
+        <w:t>pip install -r "C:\Users\YOUR_USERNAME\Documents\requirements-watcher.txt"</w:t>
       </w:r>
     </w:p>
     <w:p>

</xml_diff>